<commit_message>
Support label-based & table cell filling
Add forgiving label/heading matching and table-label filling so users can use plain labels instead of markup. Backend changes: implement _loose_match, _labelish, _match_field, _set_cell_value and _fill_table_labels in backend/app/pipeline/fill_template.py; gate loose matching to short labels, handle CJK, and use a conservative fuzzy threshold (0.90). Update heading matching and recognised_fields to include table label matches and inline markers. Template and UI updates: regenerate sample_template.docx and adjust generator (backend/templates/generate_sample_template.py) plus update frontend copy (frontend/src/pages/TemplatesPage.tsx) to explain table-label behaviour. Markers remain supported for inline placement.
</commit_message>
<xml_diff>
--- a/backend/templates/sample_template.docx
+++ b/backend/templates/sample_template.docx
@@ -15,6 +15,9 @@
     <w:p>
       <w:pPr>
         <w:jc w:val="center"/>
+        <w:pBdr>
+          <w:bottom w:val="single" w:sz="10" w:space="6" w:color="1F4E79"/>
+        </w:pBdr>
       </w:pPr>
       <w:r>
         <w:rPr>
@@ -26,28 +29,13 @@
       </w:r>
     </w:p>
     <w:p>
-      <w:pPr>
-        <w:jc w:val="center"/>
-        <w:pBdr>
-          <w:bottom w:val="single" w:sz="10" w:space="6" w:color="1F4E79"/>
-        </w:pBdr>
-      </w:pPr>
-      <w:r>
-        <w:rPr>
-          <w:color w:val="1F4E79"/>
-          <w:sz w:val="26"/>
-        </w:rPr>
-        <w:t>[[Meeting Title]]</w:t>
-      </w:r>
-    </w:p>
-    <w:p>
       <w:r>
         <w:rPr>
           <w:i/>
           <w:color w:val="6B7785"/>
           <w:sz w:val="17"/>
         </w:rPr>
-        <w:t>Template guide (delete this line before sending): keep the section headings below and the double-bracket markers in the table above - the system fills them in automatically. Restyle anything and add your logo above.</w:t>
+        <w:t>Template guide (delete this line before sending): keep the labels in the table above and the section headings below - the system fills the empty cell beside each label and the content under each heading automatically. Restyle anything and add your logo above.</w:t>
       </w:r>
     </w:p>
     <w:tbl>
@@ -71,6 +59,29 @@
               <w:rPr>
                 <w:b/>
               </w:rPr>
+              <w:t>Meeting Title</w:t>
+            </w:r>
+          </w:p>
+        </w:tc>
+        <w:tc>
+          <w:tcPr>
+            <w:tcW w:type="dxa" w:w="6912"/>
+          </w:tcPr>
+          <w:p>
+            <w:r/>
+          </w:p>
+        </w:tc>
+      </w:tr>
+      <w:tr>
+        <w:tc>
+          <w:tcPr>
+            <w:tcW w:type="dxa" w:w="2160"/>
+          </w:tcPr>
+          <w:p>
+            <w:r>
+              <w:rPr>
+                <w:b/>
+              </w:rPr>
               <w:t>Date</w:t>
             </w:r>
           </w:p>
@@ -80,9 +91,7 @@
             <w:tcW w:type="dxa" w:w="6912"/>
           </w:tcPr>
           <w:p>
-            <w:r>
-              <w:t>[[Date]]</w:t>
-            </w:r>
+            <w:r/>
           </w:p>
         </w:tc>
       </w:tr>
@@ -105,9 +114,7 @@
             <w:tcW w:type="dxa" w:w="6912"/>
           </w:tcPr>
           <w:p>
-            <w:r>
-              <w:t>[[Duration]]</w:t>
-            </w:r>
+            <w:r/>
           </w:p>
         </w:tc>
       </w:tr>
@@ -130,9 +137,7 @@
             <w:tcW w:type="dxa" w:w="6912"/>
           </w:tcPr>
           <w:p>
-            <w:r>
-              <w:t>[[Language]]</w:t>
-            </w:r>
+            <w:r/>
           </w:p>
         </w:tc>
       </w:tr>
@@ -155,9 +160,7 @@
             <w:tcW w:type="dxa" w:w="6912"/>
           </w:tcPr>
           <w:p>
-            <w:r>
-              <w:t>[[Attendees]]</w:t>
-            </w:r>
+            <w:r/>
           </w:p>
         </w:tc>
       </w:tr>

</xml_diff>